<commit_message>
Add the missing value cell to the payslip's Promotion Eligibility row
Every row in the PERFORMANCE EVALUATION table has three cells — English
label, value, Arabic label — except this one, which had two. fillTemplate
writes the value at label+1, so it landed in the Arabic cell and printed
the percentage over "معدل الاستحقاق للترقية", losing that label from the
issued payslip.

Template edited by the document owner. Verified by generating a real
payslip and reading the row back: ["Promotion Eligibility Index", "0.3%",
"معدل الاستحقاق للترقية"] — all three now. All 48 rows still fill, the
letterhead and QR survive, and it is still one page.

The three cells in this row are merged 2+2+1 where the others are 1+2+2,
so its vertical rules do not line up with the rows above. Cosmetic only:
the value cell is 15mm, wide enough for "100.0%".

Co-Authored-By: Claude Opus 5 <noreply@anthropic.com>
</commit_message>
<xml_diff>
--- a/public/PAYSLIP.docx
+++ b/public/PAYSLIP.docx
@@ -2480,8 +2480,10 @@
             </w:tblPr>
             <w:tblGrid>
               <w:gridCol w:w="1890"/>
-              <w:gridCol w:w="1620"/>
-              <w:gridCol w:w="1850"/>
+              <w:gridCol w:w="810"/>
+              <w:gridCol w:w="810"/>
+              <w:gridCol w:w="63"/>
+              <w:gridCol w:w="1787"/>
             </w:tblGrid>
             <w:tr>
               <w:trPr>
@@ -2490,7 +2492,7 @@
               <w:tc>
                 <w:tcPr>
                   <w:tcW w:w="3510" w:type="dxa"/>
-                  <w:gridSpan w:val="2"/>
+                  <w:gridSpan w:val="3"/>
                   <w:tcBorders>
                     <w:top w:val="none" w:sz="0" w:space="0" w:color="FFFFFF"/>
                     <w:left w:val="none" w:sz="0" w:space="0" w:color="FFFFFF"/>
@@ -2526,6 +2528,7 @@
               <w:tc>
                 <w:tcPr>
                   <w:tcW w:w="1850" w:type="dxa"/>
+                  <w:gridSpan w:val="2"/>
                   <w:tcBorders>
                     <w:top w:val="none" w:sz="0" w:space="0" w:color="FFFFFF"/>
                     <w:left w:val="none" w:sz="0" w:space="0" w:color="FFFFFF"/>
@@ -2602,6 +2605,7 @@
               <w:tc>
                 <w:tcPr>
                   <w:tcW w:w="1620" w:type="dxa"/>
+                  <w:gridSpan w:val="2"/>
                   <w:tcBorders>
                     <w:top w:val="none" w:sz="0" w:space="0" w:color="FFFFFF"/>
                     <w:left w:val="none" w:sz="0" w:space="0" w:color="FFFFFF"/>
@@ -2669,6 +2673,7 @@
               <w:tc>
                 <w:tcPr>
                   <w:tcW w:w="1850" w:type="dxa"/>
+                  <w:gridSpan w:val="2"/>
                   <w:tcBorders>
                     <w:top w:val="none" w:sz="0" w:space="0" w:color="FFFFFF"/>
                     <w:left w:val="none" w:sz="0" w:space="0" w:color="FFFFFF"/>
@@ -2738,6 +2743,7 @@
               <w:tc>
                 <w:tcPr>
                   <w:tcW w:w="1620" w:type="dxa"/>
+                  <w:gridSpan w:val="2"/>
                   <w:tcBorders>
                     <w:top w:val="none" w:sz="0" w:space="0" w:color="FFFFFF"/>
                     <w:left w:val="single" w:sz="2" w:space="0" w:color="E0D6DA"/>
@@ -2762,6 +2768,7 @@
               <w:tc>
                 <w:tcPr>
                   <w:tcW w:w="1850" w:type="dxa"/>
+                  <w:gridSpan w:val="2"/>
                   <w:tcBorders>
                     <w:top w:val="none" w:sz="0" w:space="0" w:color="FFFFFF"/>
                     <w:left w:val="none" w:sz="0" w:space="0" w:color="FFFFFF"/>
@@ -2828,6 +2835,7 @@
               <w:tc>
                 <w:tcPr>
                   <w:tcW w:w="1620" w:type="dxa"/>
+                  <w:gridSpan w:val="2"/>
                   <w:tcBorders>
                     <w:top w:val="none" w:sz="0" w:space="0" w:color="FFFFFF"/>
                     <w:left w:val="single" w:sz="2" w:space="0" w:color="E0D6DA"/>
@@ -2853,6 +2861,7 @@
               <w:tc>
                 <w:tcPr>
                   <w:tcW w:w="1850" w:type="dxa"/>
+                  <w:gridSpan w:val="2"/>
                   <w:tcBorders>
                     <w:top w:val="none" w:sz="0" w:space="0" w:color="FFFFFF"/>
                     <w:left w:val="none" w:sz="0" w:space="0" w:color="FFFFFF"/>
@@ -2919,6 +2928,7 @@
               <w:tc>
                 <w:tcPr>
                   <w:tcW w:w="1620" w:type="dxa"/>
+                  <w:gridSpan w:val="2"/>
                   <w:tcBorders>
                     <w:top w:val="none" w:sz="0" w:space="0" w:color="FFFFFF"/>
                     <w:left w:val="single" w:sz="2" w:space="0" w:color="E0D6DA"/>
@@ -2943,6 +2953,7 @@
               <w:tc>
                 <w:tcPr>
                   <w:tcW w:w="1850" w:type="dxa"/>
+                  <w:gridSpan w:val="2"/>
                   <w:tcBorders>
                     <w:top w:val="none" w:sz="0" w:space="0" w:color="FFFFFF"/>
                     <w:left w:val="none" w:sz="0" w:space="0" w:color="FFFFFF"/>
@@ -3009,6 +3020,7 @@
               <w:tc>
                 <w:tcPr>
                   <w:tcW w:w="1620" w:type="dxa"/>
+                  <w:gridSpan w:val="2"/>
                   <w:tcBorders>
                     <w:top w:val="none" w:sz="0" w:space="0" w:color="FFFFFF"/>
                     <w:left w:val="single" w:sz="2" w:space="0" w:color="E0D6DA"/>
@@ -3034,6 +3046,7 @@
               <w:tc>
                 <w:tcPr>
                   <w:tcW w:w="1850" w:type="dxa"/>
+                  <w:gridSpan w:val="2"/>
                   <w:tcBorders>
                     <w:top w:val="none" w:sz="0" w:space="0" w:color="FFFFFF"/>
                     <w:left w:val="none" w:sz="0" w:space="0" w:color="FFFFFF"/>
@@ -3100,6 +3113,7 @@
               <w:tc>
                 <w:tcPr>
                   <w:tcW w:w="1620" w:type="dxa"/>
+                  <w:gridSpan w:val="2"/>
                   <w:tcBorders>
                     <w:top w:val="none" w:sz="0" w:space="0" w:color="FFFFFF"/>
                     <w:left w:val="single" w:sz="2" w:space="0" w:color="E0D6DA"/>
@@ -3124,6 +3138,7 @@
               <w:tc>
                 <w:tcPr>
                   <w:tcW w:w="1850" w:type="dxa"/>
+                  <w:gridSpan w:val="2"/>
                   <w:tcBorders>
                     <w:top w:val="none" w:sz="0" w:space="0" w:color="FFFFFF"/>
                     <w:left w:val="none" w:sz="0" w:space="0" w:color="FFFFFF"/>
@@ -3192,6 +3207,7 @@
               <w:tc>
                 <w:tcPr>
                   <w:tcW w:w="1620" w:type="dxa"/>
+                  <w:gridSpan w:val="2"/>
                   <w:tcBorders>
                     <w:top w:val="none" w:sz="0" w:space="0" w:color="FFFFFF"/>
                     <w:left w:val="single" w:sz="2" w:space="0" w:color="E0D6DA"/>
@@ -3217,6 +3233,7 @@
               <w:tc>
                 <w:tcPr>
                   <w:tcW w:w="1850" w:type="dxa"/>
+                  <w:gridSpan w:val="2"/>
                   <w:tcBorders>
                     <w:top w:val="none" w:sz="0" w:space="0" w:color="FFFFFF"/>
                     <w:left w:val="none" w:sz="0" w:space="0" w:color="FFFFFF"/>
@@ -3255,7 +3272,7 @@
               </w:trPr>
               <w:tc>
                 <w:tcPr>
-                  <w:tcW w:w="3510" w:type="dxa"/>
+                  <w:tcW w:w="2700" w:type="dxa"/>
                   <w:gridSpan w:val="2"/>
                   <w:tcBorders>
                     <w:top w:val="none" w:sz="0" w:space="0" w:color="FFFFFF"/>
@@ -3291,7 +3308,8 @@
               </w:tc>
               <w:tc>
                 <w:tcPr>
-                  <w:tcW w:w="1850" w:type="dxa"/>
+                  <w:tcW w:w="873" w:type="dxa"/>
+                  <w:gridSpan w:val="2"/>
                   <w:tcBorders>
                     <w:top w:val="none" w:sz="0" w:space="0" w:color="FFFFFF"/>
                     <w:left w:val="none" w:sz="0" w:space="0" w:color="FFFFFF"/>
@@ -3299,12 +3317,29 @@
                     <w:right w:val="none" w:sz="0" w:space="0" w:color="FFFFFF"/>
                   </w:tcBorders>
                   <w:shd w:val="clear" w:color="auto" w:fill="561C2F"/>
-                  <w:tcMar>
-                    <w:top w:w="30" w:type="dxa"/>
-                    <w:left w:w="95" w:type="dxa"/>
-                    <w:bottom w:w="30" w:type="dxa"/>
-                    <w:right w:w="95" w:type="dxa"/>
-                  </w:tcMar>
+                  <w:vAlign w:val="center"/>
+                </w:tcPr>
+                <w:p>
+                  <w:pPr>
+                    <w:bidi/>
+                    <w:spacing w:before="10" w:after="10" w:line="200" w:lineRule="auto"/>
+                    <w:jc w:val="center"/>
+                    <w:rPr>
+                      <w:color w:val="FFFFFF" w:themeColor="background1"/>
+                    </w:rPr>
+                  </w:pPr>
+                </w:p>
+              </w:tc>
+              <w:tc>
+                <w:tcPr>
+                  <w:tcW w:w="1787" w:type="dxa"/>
+                  <w:tcBorders>
+                    <w:top w:val="none" w:sz="0" w:space="0" w:color="FFFFFF"/>
+                    <w:left w:val="none" w:sz="0" w:space="0" w:color="FFFFFF"/>
+                    <w:bottom w:val="none" w:sz="0" w:space="0" w:color="FFFFFF"/>
+                    <w:right w:val="none" w:sz="0" w:space="0" w:color="FFFFFF"/>
+                  </w:tcBorders>
+                  <w:shd w:val="clear" w:color="auto" w:fill="561C2F"/>
                   <w:vAlign w:val="center"/>
                 </w:tcPr>
                 <w:p>

</xml_diff>